<commit_message>
Publish model-first ECON 803 textbook baseline
</commit_message>
<xml_diff>
--- a/course/ECON_803_Fall_2026_Course_Outline.docx
+++ b/course/ECON_803_Fall_2026_Course_Outline.docx
@@ -582,7 +582,7 @@
     <w:p>
       <w:pPr/>
       <w:r>
-        <w:t>ECON 803 is a core course in the first-year PhD program. It develops the language of modern microeconomic theory from individual choice and demand through uncertainty, production, competitive equilibrium, matching, random utility, behavioral theory, and computational general equilibrium. The course emphasizes explicit assumptions, proof strategy, logical dependencies, and the testable implications of theory.</w:t>
+        <w:t>ECON 803 is a core course in the first-year PhD program. It develops the language of modern microeconomic theory from utility maximization and demand through revealed preference, abstract and stochastic choice, costly attention, production, competitive equilibrium, matching, and computable general equilibrium. The course emphasizes explicit assumptions, proof strategy, logical dependencies, and the testable implications of theory.</w:t>
       </w:r>
     </w:p>
     <w:p>
@@ -649,7 +649,7 @@
     <w:p>
       <w:pPr/>
       <w:r>
-        <w:t>Problem sets 10%; midterm examination 40%; final examination 50%. Problem sets are released in teaching order. Solutions and answer keys are distributed separately by the instructor and are not part of the main text.</w:t>
+        <w:t>Problem sets 10%; midterm examination 40%; final examination 50%. Problem sets are released in teaching order. Solutions and answer keys are distributed separately by the instructor and are not part of the main text or this public book repository.</w:t>
       </w:r>
     </w:p>
     <w:p>
@@ -663,7 +663,7 @@
     <w:p>
       <w:pPr/>
       <w:r>
-        <w:t>Required course text: Victor H. Aguiar, Microeconomic Theory I, Fall 2026 course notes. The public PDF and editable LyX source are maintained in the Fall 2026 course repository.</w:t>
+        <w:t>Required course text: Victor H. Aguiar, Microeconomic Theory I, Fall 2026 course notes. The public PDF and authoritative editable LyX source are maintained in the Fall 2026 course repository.</w:t>
       </w:r>
     </w:p>
     <w:p>
@@ -691,7 +691,7 @@
         <w:pStyle w:val="Small"/>
       </w:pPr>
       <w:r>
-        <w:t>The thirteen Friday meetings follow the book's logical spine. Order-theoretic foundations appear in Appendix A of the notes and are used throughout the course.</w:t>
+        <w:t>The thirteen Friday meetings follow the book’s model-first logical spine. Order-theoretic foundations appear in Appendix A of the notes and are used throughout the course.</w:t>
       </w:r>
     </w:p>
     <w:tbl>
@@ -814,6 +814,9 @@
         </w:tc>
       </w:tr>
       <w:tr>
+        <w:trPr>
+          <w:cantSplit/>
+        </w:trPr>
         <w:tc>
           <w:tcPr>
             <w:tcW w:type="dxa" w:w="893"/>
@@ -866,7 +869,7 @@
               <w:spacing w:after="0"/>
             </w:pPr>
             <w:r>
-              <w:t>Choice data and demand</w:t>
+              <w:t>Utility maximization and demand</w:t>
             </w:r>
           </w:p>
         </w:tc>
@@ -894,12 +897,15 @@
               <w:spacing w:after="0"/>
             </w:pPr>
             <w:r>
-              <w:t>Budget sets, Walrasian demand, comparative statics, and WARP.</w:t>
+              <w:t>Consumption sets, budgets, ordinal utility, existence, Marshallian demand, and indirect utility.</w:t>
             </w:r>
           </w:p>
         </w:tc>
       </w:tr>
       <w:tr>
+        <w:trPr>
+          <w:cantSplit/>
+        </w:trPr>
         <w:tc>
           <w:tcPr>
             <w:tcW w:type="dxa" w:w="893"/>
@@ -954,7 +960,7 @@
               <w:spacing w:after="0"/>
             </w:pPr>
             <w:r>
-              <w:t>Preferences and choice</w:t>
+              <w:t>Duality, comparative statics, and welfare</w:t>
             </w:r>
           </w:p>
         </w:tc>
@@ -983,12 +989,15 @@
               <w:spacing w:after="0"/>
             </w:pPr>
             <w:r>
-              <w:t>Preference relations, choice correspondences, rationalization, and utility representation.</w:t>
+              <w:t>Expenditure minimization, Hicksian demand, Roy’s identity, Shephard’s lemma, Slutsky, and welfare variation.</w:t>
             </w:r>
           </w:p>
         </w:tc>
       </w:tr>
       <w:tr>
+        <w:trPr>
+          <w:cantSplit/>
+        </w:trPr>
         <w:tc>
           <w:tcPr>
             <w:tcW w:type="dxa" w:w="893"/>
@@ -1041,7 +1050,7 @@
               <w:spacing w:after="0"/>
             </w:pPr>
             <w:r>
-              <w:t>Utility maximization and duality</w:t>
+              <w:t>Revealed preference and recoverability</w:t>
             </w:r>
           </w:p>
         </w:tc>
@@ -1069,12 +1078,15 @@
               <w:spacing w:after="0"/>
             </w:pPr>
             <w:r>
-              <w:t>UMP and EMP, Roy’s identity, Hicksian demand, Shepard’s lemma, and Slutsky.</w:t>
+              <w:t>WARP, integrability, GARP, Afriat’s theorem, WGARP, coalitional multi-utility, and welfare bounds.</w:t>
             </w:r>
           </w:p>
         </w:tc>
       </w:tr>
       <w:tr>
+        <w:trPr>
+          <w:cantSplit/>
+        </w:trPr>
         <w:tc>
           <w:tcPr>
             <w:tcW w:type="dxa" w:w="893"/>
@@ -1129,7 +1141,7 @@
               <w:spacing w:after="0"/>
             </w:pPr>
             <w:r>
-              <w:t>Integrability and revealed preference</w:t>
+              <w:t>Choice without budget geometry</w:t>
             </w:r>
           </w:p>
         </w:tc>
@@ -1158,12 +1170,15 @@
               <w:spacing w:after="0"/>
             </w:pPr>
             <w:r>
-              <w:t>GARP, SARP, Afriat’s theorem, welfare bounds, and measurement issues.</w:t>
+              <w:t>Preference relations, utility representation, choice correspondences, and rationalization.</w:t>
             </w:r>
           </w:p>
         </w:tc>
       </w:tr>
       <w:tr>
+        <w:trPr>
+          <w:cantSplit/>
+        </w:trPr>
         <w:tc>
           <w:tcPr>
             <w:tcW w:type="dxa" w:w="893"/>
@@ -1216,7 +1231,7 @@
               <w:spacing w:after="0"/>
             </w:pPr>
             <w:r>
-              <w:t>Behavioral consumer theory</w:t>
+              <w:t>Expected utility and risk</w:t>
             </w:r>
           </w:p>
         </w:tc>
@@ -1244,12 +1259,15 @@
               <w:spacing w:after="0"/>
             </w:pPr>
             <w:r>
-              <w:t>Sparse-max demand, perceived prices, limited attention, and rational inattention.</w:t>
+              <w:t>Expected-utility representation, stochastic dominance, risk attitudes, applications, and evidence.</w:t>
             </w:r>
           </w:p>
         </w:tc>
       </w:tr>
       <w:tr>
+        <w:trPr>
+          <w:cantSplit/>
+        </w:trPr>
         <w:tc>
           <w:tcPr>
             <w:tcW w:type="dxa" w:w="893"/>
@@ -1304,7 +1322,7 @@
               <w:spacing w:after="0"/>
             </w:pPr>
             <w:r>
-              <w:t>Choice under uncertainty</w:t>
+              <w:t>Stochastic choice and attention</w:t>
             </w:r>
           </w:p>
         </w:tc>
@@ -1333,12 +1351,15 @@
               <w:spacing w:after="0"/>
             </w:pPr>
             <w:r>
-              <w:t>Expected utility, risk attitudes, dominance, and experimental evidence.</w:t>
+              <w:t>Random utility, logit and IIA, random expected utility, sparse-max demand, and rational inattention.</w:t>
             </w:r>
           </w:p>
         </w:tc>
       </w:tr>
       <w:tr>
+        <w:trPr>
+          <w:cantSplit/>
+        </w:trPr>
         <w:tc>
           <w:tcPr>
             <w:tcW w:type="dxa" w:w="893"/>
@@ -1391,7 +1412,7 @@
               <w:spacing w:after="0"/>
             </w:pPr>
             <w:r>
-              <w:t>Aggregation and random choice</w:t>
+              <w:t>Aggregation</w:t>
             </w:r>
           </w:p>
         </w:tc>
@@ -1419,12 +1440,15 @@
               <w:spacing w:after="0"/>
             </w:pPr>
             <w:r>
-              <w:t>Gorman aggregation, aggregate restrictions, random utility, and logit.</w:t>
+              <w:t>Gorman aggregation, representative consumers, and restrictions on aggregate demand.</w:t>
             </w:r>
           </w:p>
         </w:tc>
       </w:tr>
       <w:tr>
+        <w:trPr>
+          <w:cantSplit/>
+        </w:trPr>
         <w:tc>
           <w:tcPr>
             <w:tcW w:type="dxa" w:w="893"/>
@@ -1514,6 +1538,9 @@
         </w:tc>
       </w:tr>
       <w:tr>
+        <w:trPr>
+          <w:cantSplit/>
+        </w:trPr>
         <w:tc>
           <w:tcPr>
             <w:tcW w:type="dxa" w:w="893"/>
@@ -1566,7 +1593,7 @@
               <w:spacing w:after="0"/>
             </w:pPr>
             <w:r>
-              <w:t>Markets and welfare</w:t>
+              <w:t>Competitive markets and welfare</w:t>
             </w:r>
           </w:p>
         </w:tc>
@@ -1600,6 +1627,9 @@
         </w:tc>
       </w:tr>
       <w:tr>
+        <w:trPr>
+          <w:cantSplit/>
+        </w:trPr>
         <w:tc>
           <w:tcPr>
             <w:tcW w:type="dxa" w:w="893"/>
@@ -1683,12 +1713,15 @@
               <w:spacing w:after="0"/>
             </w:pPr>
             <w:r>
-              <w:t>Excess demand, existence, regularity, local and global uniqueness, and the core.</w:t>
+              <w:t>Excess demand, existence, regularity, uniqueness, and the core.</w:t>
             </w:r>
           </w:p>
         </w:tc>
       </w:tr>
       <w:tr>
+        <w:trPr>
+          <w:cantSplit/>
+        </w:trPr>
         <w:tc>
           <w:tcPr>
             <w:tcW w:type="dxa" w:w="893"/>
@@ -1741,7 +1774,7 @@
               <w:spacing w:after="0"/>
             </w:pPr>
             <w:r>
-              <w:t>Equilibrium with uncertainty</w:t>
+              <w:t>Empirical and sequential equilibrium</w:t>
             </w:r>
           </w:p>
         </w:tc>
@@ -1769,12 +1802,15 @@
               <w:spacing w:after="0"/>
             </w:pPr>
             <w:r>
-              <w:t>Revealed equilibrium, Arrow–Debreu allocations, sequential trade, and Radner markets.</w:t>
+              <w:t>Testable equilibrium restrictions, Arrow–Debreu allocations, sequential trade, and Radner markets.</w:t>
             </w:r>
           </w:p>
         </w:tc>
       </w:tr>
       <w:tr>
+        <w:trPr>
+          <w:cantSplit/>
+        </w:trPr>
         <w:tc>
           <w:tcPr>
             <w:tcW w:type="dxa" w:w="893"/>
@@ -1858,12 +1894,15 @@
               <w:spacing w:after="0"/>
             </w:pPr>
             <w:r>
-              <w:t>Deferred acceptance, stability, the core of housing markets, and top trading cycles.</w:t>
+              <w:t>Deferred acceptance, stability, housing-market cores, and top trading cycles.</w:t>
             </w:r>
           </w:p>
         </w:tc>
       </w:tr>
       <w:tr>
+        <w:trPr>
+          <w:cantSplit/>
+        </w:trPr>
         <w:tc>
           <w:tcPr>
             <w:tcW w:type="dxa" w:w="893"/>
@@ -1916,7 +1955,7 @@
               <w:spacing w:after="0"/>
             </w:pPr>
             <w:r>
-              <w:t>Quantitative applications</w:t>
+              <w:t>Computable equilibrium</w:t>
             </w:r>
           </w:p>
         </w:tc>
@@ -1944,7 +1983,7 @@
               <w:spacing w:after="0"/>
             </w:pPr>
             <w:r>
-              <w:t>CGE calibration, counterfactuals, and behavioral general equilibrium.</w:t>
+              <w:t>CGE calibration, model closure, replication, counterfactuals, and behavioral general equilibrium.</w:t>
             </w:r>
           </w:p>
         </w:tc>
@@ -2718,9 +2757,6 @@
     <w:qFormat/>
     <w:rsid w:val="00FC693F"/>
     <w:pPr>
-      <w:pBdr>
-        <w:bottom w:val="single" w:sz="8" w:space="4" w:color="4F81BD" w:themeColor="accent1"/>
-      </w:pBdr>
       <w:spacing w:after="60" w:line="240" w:lineRule="auto"/>
       <w:contextualSpacing/>
     </w:pPr>
@@ -2767,7 +2803,7 @@
       <w:rFonts w:asciiTheme="majorHAnsi" w:eastAsiaTheme="majorEastAsia" w:hAnsiTheme="majorHAnsi" w:cstheme="majorBidi" w:ascii="Aptos" w:hAnsi="Aptos"/>
       <w:i/>
       <w:iCs/>
-      <w:color w:val="444444"/>
+      <w:color w:val="000000"/>
       <w:spacing w:val="15"/>
       <w:sz w:val="26"/>
       <w:szCs w:val="24"/>

</xml_diff>